<commit_message>
Add Human_Writer skill; rewrite Chowdeck cover letter (human voice, real projects)
</commit_message>
<xml_diff>
--- a/Draft&Resume/GabrielIsuekebho_Chowdeck_CoverLetter.docx
+++ b/Draft&Resume/GabrielIsuekebho_Chowdeck_CoverLetter.docx
@@ -21,24 +21,72 @@
       </w:pPr>
       <w:r>
         <w:rPr>
-          <w:b w:val="0"/>
           <w:color w:val="4A5560"/>
           <w:sz w:val="18"/>
         </w:rPr>
-        <w:t>Lagos, Nigeria  ·  gisuekebho5880@gmail.com  ·  (+234) 808 589 5880</w:t>
+        <w:t xml:space="preserve">Lagos, Nigeria    (+234) 808 589 5880    gisuekebho5880@gmail.com    </w:t>
       </w:r>
     </w:p>
     <w:p>
       <w:pPr>
         <w:spacing w:after="280" w:line="276" w:lineRule="auto"/>
       </w:pPr>
+      <w:hyperlink r:id="rId9">
+        <w:r>
+          <w:rPr>
+            <w:color w:val="1155CC"/>
+            <w:u w:val="single"/>
+            <w:sz w:val="19"/>
+            <w:b/>
+          </w:rPr>
+          <w:t>LinkedIn</w:t>
+        </w:r>
+      </w:hyperlink>
+      <w:r>
+        <w:rPr>
+          <w:sz w:val="18"/>
+        </w:rPr>
+        <w:t xml:space="preserve">    </w:t>
+      </w:r>
+      <w:hyperlink r:id="rId10">
+        <w:r>
+          <w:rPr>
+            <w:color w:val="1155CC"/>
+            <w:u w:val="single"/>
+            <w:sz w:val="19"/>
+            <w:b/>
+          </w:rPr>
+          <w:t>GitHub</w:t>
+        </w:r>
+      </w:hyperlink>
+      <w:r>
+        <w:rPr>
+          <w:sz w:val="18"/>
+        </w:rPr>
+        <w:t xml:space="preserve">    </w:t>
+      </w:r>
+      <w:hyperlink r:id="rId11">
+        <w:r>
+          <w:rPr>
+            <w:color w:val="1155CC"/>
+            <w:u w:val="single"/>
+            <w:sz w:val="19"/>
+            <w:b/>
+          </w:rPr>
+          <w:t>Portfolio</w:t>
+        </w:r>
+      </w:hyperlink>
+    </w:p>
+    <w:p>
+      <w:pPr>
+        <w:spacing w:after="200" w:line="276" w:lineRule="auto"/>
+      </w:pPr>
       <w:r>
         <w:rPr>
           <w:b w:val="0"/>
-          <w:color w:val="4A5560"/>
-          <w:sz w:val="18"/>
+          <w:sz w:val="21"/>
         </w:rPr>
-        <w:t>linkedin.com/in/gabrielisuekebho  ·  github.com/conradgabe  ·  portfolio-mini-bay.vercel.app</w:t>
+        <w:t>Dear Chowdeck team,</w:t>
       </w:r>
     </w:p>
     <w:p>
@@ -50,7 +98,7 @@
           <w:b w:val="0"/>
           <w:sz w:val="21"/>
         </w:rPr>
-        <w:t>Dear Chowdeck Team,</w:t>
+        <w:t>Most of the things I've built started as a personal annoyance. PG-Tailor exists because I got tired of rewriting my CV for every single role, so I made something that tailors it for me and ranks job posts by how well they actually fit. ClipN exists because cutting long videos into short clips by hand is miserable, so I built an AI pipeline that finds the good moments and reframes them on its own. I build to fix things that bug me.</w:t>
       </w:r>
     </w:p>
     <w:p>
@@ -62,7 +110,7 @@
           <w:b w:val="0"/>
           <w:sz w:val="21"/>
         </w:rPr>
-        <w:t>I'm excited to join your Early Careers Talent Pool. What you're building, reliable on-demand delivery of food, medicine, groceries, and packages across Africa, is exactly the kind of problem I want to spend my early career on: high-volume, operationally hard, and genuinely useful to people every day.</w:t>
+        <w:t>Chowdeck is a whole company built on that same instinct, just at a scale I find genuinely exciting: getting food, medicine, and groceries to people's doors without the usual hassle, across cities most companies find too hard to serve.</w:t>
       </w:r>
     </w:p>
     <w:p>
@@ -74,7 +122,7 @@
           <w:b w:val="0"/>
           <w:sz w:val="21"/>
         </w:rPr>
-        <w:t>I'm a recent Biochemistry graduate from the University of Benin who moved into software engineering, and over the past two to three years I've built and shipped real systems across fintech, carbon-tech, and AI infrastructure. Recently that has meant deploying LLM inference pipelines on GPU servers, building backend services and data pipelines, and working with cross-functional teams to get features into production. I learn quickly, take ownership of my work, and do my best thinking in fast-moving environments, which is why a startup scaling across African cities appeals to me so much.</w:t>
+        <w:t>On paper I'm a Biochemistry graduate from the University of Benin who got pulled into software and stayed. In practice I've spent the last couple of years shipping real backend systems. Right now I run LLMs on GPU servers and build the services around them at Lustrew Dynamics, and during my NYSC year at Codeware I rebuilt a C# platform so one codebase could serve retail, pharmacies, and restaurants instead of three separate ones. I also built Algome, a trading backtester where I cared more about whether the numbers could be trusted than about how the charts looked.</w:t>
       </w:r>
     </w:p>
     <w:p>
@@ -86,7 +134,7 @@
           <w:b w:val="0"/>
           <w:sz w:val="21"/>
         </w:rPr>
-        <w:t>I'd be glad to be considered for the Engineering or Data, ML &amp; AI tracks, though I'm genuinely open to where I can add the most value. You can see some of my work at portfolio-mini-bay.vercel.app and github.com/conradgabe.</w:t>
+        <w:t>I'm early in my career and I won't pretend otherwise. What I can promise is that I ship, I own what breaks, and I pick things up fast, which is most of the job on a team moving as quickly as yours. I'd be glad to be considered for Engineering or Data and ML, or honestly wherever I'd be most useful.</w:t>
       </w:r>
     </w:p>
     <w:p>
@@ -98,19 +146,7 @@
           <w:b w:val="0"/>
           <w:sz w:val="21"/>
         </w:rPr>
-        <w:t>Thank you for keeping my details on file. I'd love the chance to grow with Chowdeck as you build what's next.</w:t>
-      </w:r>
-    </w:p>
-    <w:p>
-      <w:pPr>
-        <w:spacing w:after="40" w:line="276" w:lineRule="auto"/>
-      </w:pPr>
-      <w:r>
-        <w:rPr>
-          <w:b w:val="0"/>
-          <w:sz w:val="21"/>
-        </w:rPr>
-        <w:t>Warm regards,</w:t>
+        <w:t>Thanks for reading, and for keeping my details on file.</w:t>
       </w:r>
     </w:p>
     <w:p>

</xml_diff>